<commit_message>
Remove repository link from DOKUMENTASI
Only the live demo URLs remain in the deliverable documentation.
</commit_message>
<xml_diff>
--- a/DOKUMENTASI.docx
+++ b/DOKUMENTASI.docx
@@ -2,7 +2,7 @@
 <file path=word/document.xml><?xml version="1.0" encoding="utf-8"?>
 <w:document xmlns:w="http://schemas.openxmlformats.org/wordprocessingml/2006/main" xmlns:m="http://schemas.openxmlformats.org/officeDocument/2006/math" xmlns:r="http://schemas.openxmlformats.org/officeDocument/2006/relationships" xmlns:o="urn:schemas-microsoft-com:office:office" xmlns:v="urn:schemas-microsoft-com:vml" xmlns:w10="urn:schemas-microsoft-com:office:word" xmlns:a="http://schemas.openxmlformats.org/drawingml/2006/main" xmlns:pic="http://schemas.openxmlformats.org/drawingml/2006/picture" xmlns:wp="http://schemas.openxmlformats.org/drawingml/2006/wordprocessingDrawing">
   <w:body>
-    <w:bookmarkStart w:id="64" w:name="dokumentasi-rumah-daun-toko-tanaman-hias"/>
+    <w:bookmarkStart w:id="63" w:name="dokumentasi-rumah-daun-toko-tanaman-hias"/>
     <w:p>
       <w:pPr>
         <w:pStyle w:val="Heading1"/>
@@ -37,7 +37,7 @@
         </w:pict>
       </w:r>
     </w:p>
-    <w:bookmarkStart w:id="12" w:name="a.-informasi-project"/>
+    <w:bookmarkStart w:id="11" w:name="a.-informasi-project"/>
     <w:p>
       <w:pPr>
         <w:pStyle w:val="Heading2"/>
@@ -211,121 +211,97 @@
       </w:hyperlink>
     </w:p>
     <w:p>
-      <w:pPr>
-        <w:pStyle w:val="Compact"/>
-        <w:numPr>
-          <w:ilvl w:val="1"/>
-          <w:numId w:val="1003"/>
-        </w:numPr>
-      </w:pPr>
-      <w:r>
-        <w:t xml:space="preserve">Repository:</w:t>
-      </w:r>
-      <w:r>
-        <w:t xml:space="preserve"> </w:t>
-      </w:r>
-      <w:hyperlink r:id="rId11">
-        <w:r>
-          <w:rPr>
-            <w:rFonts w:ascii="Times New Roman" w:hAnsi="Times New Roman" w:eastAsia="Times New Roman" w:cs="Times New Roman"/>
-            <w:rStyle w:val="Hyperlink"/>
-          </w:rPr>
-          <w:t xml:space="preserve">https://github.com/bagjaalam1/toko-online</w:t>
-        </w:r>
-      </w:hyperlink>
-    </w:p>
-    <w:p>
       <w:r>
         <w:pict>
           <v:rect style="width:0;height:1.5pt" o:hralign="center" o:hrstd="t" o:hr="t"/>
         </w:pict>
       </w:r>
     </w:p>
+    <w:bookmarkEnd w:id="11"/>
+    <w:bookmarkStart w:id="14" w:name="b.-persiapan"/>
+    <w:p>
+      <w:pPr>
+        <w:pStyle w:val="Heading2"/>
+      </w:pPr>
+      <w:r>
+        <w:t xml:space="preserve">B. Persiapan</w:t>
+      </w:r>
+    </w:p>
+    <w:bookmarkStart w:id="12" w:name="install-node.js"/>
+    <w:p>
+      <w:pPr>
+        <w:pStyle w:val="Heading3"/>
+      </w:pPr>
+      <w:r>
+        <w:t xml:space="preserve">1. Install Node.js</w:t>
+      </w:r>
+    </w:p>
+    <w:p>
+      <w:pPr>
+        <w:pStyle w:val="FirstParagraph"/>
+      </w:pPr>
+      <w:r>
+        <w:t xml:space="preserve">Download dan install dari https://nodejs.org (versi LTS, 20.x atau lebih baru).</w:t>
+      </w:r>
+      <w:r>
+        <w:t xml:space="preserve"> </w:t>
+      </w:r>
+      <w:r>
+        <w:t xml:space="preserve">Verifikasi:</w:t>
+      </w:r>
+    </w:p>
+    <w:p>
+      <w:pPr>
+        <w:pStyle w:val="SourceCode"/>
+      </w:pPr>
+      <w:r>
+        <w:rPr>
+          <w:rFonts w:ascii="Consolas" w:hAnsi="Consolas" w:eastAsia="Consolas" w:cs="Consolas"/>
+          <w:rStyle w:val="ExtensionTok"/>
+        </w:rPr>
+        <w:t xml:space="preserve">node</w:t>
+      </w:r>
+      <w:r>
+        <w:rPr>
+          <w:rFonts w:ascii="Consolas" w:hAnsi="Consolas" w:eastAsia="Consolas" w:cs="Consolas"/>
+          <w:rStyle w:val="NormalTok"/>
+        </w:rPr>
+        <w:t xml:space="preserve"> </w:t>
+      </w:r>
+      <w:r>
+        <w:rPr>
+          <w:rFonts w:ascii="Consolas" w:hAnsi="Consolas" w:eastAsia="Consolas" w:cs="Consolas"/>
+          <w:rStyle w:val="AttributeTok"/>
+        </w:rPr>
+        <w:t xml:space="preserve">--version</w:t>
+      </w:r>
+      <w:r>
+        <w:br/>
+      </w:r>
+      <w:r>
+        <w:rPr>
+          <w:rFonts w:ascii="Consolas" w:hAnsi="Consolas" w:eastAsia="Consolas" w:cs="Consolas"/>
+          <w:rStyle w:val="ExtensionTok"/>
+        </w:rPr>
+        <w:t xml:space="preserve">npm</w:t>
+      </w:r>
+      <w:r>
+        <w:rPr>
+          <w:rFonts w:ascii="Consolas" w:hAnsi="Consolas" w:eastAsia="Consolas" w:cs="Consolas"/>
+          <w:rStyle w:val="NormalTok"/>
+        </w:rPr>
+        <w:t xml:space="preserve"> </w:t>
+      </w:r>
+      <w:r>
+        <w:rPr>
+          <w:rFonts w:ascii="Consolas" w:hAnsi="Consolas" w:eastAsia="Consolas" w:cs="Consolas"/>
+          <w:rStyle w:val="AttributeTok"/>
+        </w:rPr>
+        <w:t xml:space="preserve">--version</w:t>
+      </w:r>
+    </w:p>
     <w:bookmarkEnd w:id="12"/>
-    <w:bookmarkStart w:id="15" w:name="b.-persiapan"/>
-    <w:p>
-      <w:pPr>
-        <w:pStyle w:val="Heading2"/>
-      </w:pPr>
-      <w:r>
-        <w:t xml:space="preserve">B. Persiapan</w:t>
-      </w:r>
-    </w:p>
-    <w:bookmarkStart w:id="13" w:name="install-node.js"/>
-    <w:p>
-      <w:pPr>
-        <w:pStyle w:val="Heading3"/>
-      </w:pPr>
-      <w:r>
-        <w:t xml:space="preserve">1. Install Node.js</w:t>
-      </w:r>
-    </w:p>
-    <w:p>
-      <w:pPr>
-        <w:pStyle w:val="FirstParagraph"/>
-      </w:pPr>
-      <w:r>
-        <w:t xml:space="preserve">Download dan install dari https://nodejs.org (versi LTS, 20.x atau lebih baru).</w:t>
-      </w:r>
-      <w:r>
-        <w:t xml:space="preserve"> </w:t>
-      </w:r>
-      <w:r>
-        <w:t xml:space="preserve">Verifikasi:</w:t>
-      </w:r>
-    </w:p>
-    <w:p>
-      <w:pPr>
-        <w:pStyle w:val="SourceCode"/>
-      </w:pPr>
-      <w:r>
-        <w:rPr>
-          <w:rFonts w:ascii="Consolas" w:hAnsi="Consolas" w:eastAsia="Consolas" w:cs="Consolas"/>
-          <w:rStyle w:val="ExtensionTok"/>
-        </w:rPr>
-        <w:t xml:space="preserve">node</w:t>
-      </w:r>
-      <w:r>
-        <w:rPr>
-          <w:rFonts w:ascii="Consolas" w:hAnsi="Consolas" w:eastAsia="Consolas" w:cs="Consolas"/>
-          <w:rStyle w:val="NormalTok"/>
-        </w:rPr>
-        <w:t xml:space="preserve"> </w:t>
-      </w:r>
-      <w:r>
-        <w:rPr>
-          <w:rFonts w:ascii="Consolas" w:hAnsi="Consolas" w:eastAsia="Consolas" w:cs="Consolas"/>
-          <w:rStyle w:val="AttributeTok"/>
-        </w:rPr>
-        <w:t xml:space="preserve">--version</w:t>
-      </w:r>
-      <w:r>
-        <w:br/>
-      </w:r>
-      <w:r>
-        <w:rPr>
-          <w:rFonts w:ascii="Consolas" w:hAnsi="Consolas" w:eastAsia="Consolas" w:cs="Consolas"/>
-          <w:rStyle w:val="ExtensionTok"/>
-        </w:rPr>
-        <w:t xml:space="preserve">npm</w:t>
-      </w:r>
-      <w:r>
-        <w:rPr>
-          <w:rFonts w:ascii="Consolas" w:hAnsi="Consolas" w:eastAsia="Consolas" w:cs="Consolas"/>
-          <w:rStyle w:val="NormalTok"/>
-        </w:rPr>
-        <w:t xml:space="preserve"> </w:t>
-      </w:r>
-      <w:r>
-        <w:rPr>
-          <w:rFonts w:ascii="Consolas" w:hAnsi="Consolas" w:eastAsia="Consolas" w:cs="Consolas"/>
-          <w:rStyle w:val="AttributeTok"/>
-        </w:rPr>
-        <w:t xml:space="preserve">--version</w:t>
-      </w:r>
-    </w:p>
-    <w:bookmarkEnd w:id="13"/>
-    <w:bookmarkStart w:id="14" w:name="setup-mongodb-atlas-gratis"/>
+    <w:bookmarkStart w:id="13" w:name="setup-mongodb-atlas-gratis"/>
     <w:p>
       <w:pPr>
         <w:pStyle w:val="Heading3"/>
@@ -686,9 +662,9 @@
         </w:pict>
       </w:r>
     </w:p>
+    <w:bookmarkEnd w:id="13"/>
     <w:bookmarkEnd w:id="14"/>
-    <w:bookmarkEnd w:id="15"/>
-    <w:bookmarkStart w:id="16" w:name="c.-menjalankan-backend"/>
+    <w:bookmarkStart w:id="15" w:name="c.-menjalankan-backend"/>
     <w:p>
       <w:pPr>
         <w:pStyle w:val="Heading2"/>
@@ -947,8 +923,8 @@
         </w:pict>
       </w:r>
     </w:p>
-    <w:bookmarkEnd w:id="16"/>
-    <w:bookmarkStart w:id="17" w:name="d.-menjalankan-frontend"/>
+    <w:bookmarkEnd w:id="15"/>
+    <w:bookmarkStart w:id="16" w:name="d.-menjalankan-frontend"/>
     <w:p>
       <w:pPr>
         <w:pStyle w:val="Heading2"/>
@@ -1143,8 +1119,8 @@
         </w:pict>
       </w:r>
     </w:p>
-    <w:bookmarkEnd w:id="17"/>
-    <w:bookmarkStart w:id="18" w:name="e.-menguji-api-dengan-postmancurl"/>
+    <w:bookmarkEnd w:id="16"/>
+    <w:bookmarkStart w:id="17" w:name="e.-menguji-api-dengan-postmancurl"/>
     <w:p>
       <w:pPr>
         <w:pStyle w:val="Heading2"/>
@@ -1584,8 +1560,8 @@
         </w:pict>
       </w:r>
     </w:p>
-    <w:bookmarkEnd w:id="18"/>
-    <w:bookmarkStart w:id="19" w:name="f.-struktur-routing-frontend"/>
+    <w:bookmarkEnd w:id="17"/>
+    <w:bookmarkStart w:id="18" w:name="f.-struktur-routing-frontend"/>
     <w:p>
       <w:pPr>
         <w:pStyle w:val="Heading2"/>
@@ -1886,8 +1862,8 @@
         </w:pict>
       </w:r>
     </w:p>
-    <w:bookmarkEnd w:id="19"/>
-    <w:bookmarkStart w:id="20" w:name="g.-desain-ux"/>
+    <w:bookmarkEnd w:id="18"/>
+    <w:bookmarkStart w:id="19" w:name="g.-desain-ux"/>
     <w:p>
       <w:pPr>
         <w:pStyle w:val="Heading2"/>
@@ -2036,8 +2012,8 @@
         </w:pict>
       </w:r>
     </w:p>
-    <w:bookmarkEnd w:id="20"/>
-    <w:bookmarkStart w:id="62" w:name="h.-screenshot-hasil-aplikasi"/>
+    <w:bookmarkEnd w:id="19"/>
+    <w:bookmarkStart w:id="61" w:name="h.-screenshot-hasil-aplikasi"/>
     <w:p>
       <w:pPr>
         <w:pStyle w:val="Heading2"/>
@@ -2046,7 +2022,7 @@
         <w:t xml:space="preserve">H. Screenshot Hasil Aplikasi</w:t>
       </w:r>
     </w:p>
-    <w:bookmarkStart w:id="24" w:name="halaman-beranda"/>
+    <w:bookmarkStart w:id="23" w:name="halaman-beranda"/>
     <w:p>
       <w:pPr>
         <w:pStyle w:val="Heading3"/>
@@ -2064,18 +2040,18 @@
           <wp:inline>
             <wp:extent cx="5334000" cy="6608233"/>
             <wp:effectExtent b="0" l="0" r="0" t="0"/>
-            <wp:docPr descr="Halaman Beranda" title="" id="22" name="Picture"/>
+            <wp:docPr descr="Halaman Beranda" title="" id="21" name="Picture"/>
             <a:graphic>
               <a:graphicData uri="http://schemas.openxmlformats.org/drawingml/2006/picture">
                 <pic:pic>
                   <pic:nvPicPr>
-                    <pic:cNvPr descr="screenshots/01-beranda.png" id="23" name="Picture"/>
+                    <pic:cNvPr descr="screenshots/01-beranda.png" id="22" name="Picture"/>
                     <pic:cNvPicPr>
                       <a:picLocks noChangeArrowheads="1" noChangeAspect="1"/>
                     </pic:cNvPicPr>
                   </pic:nvPicPr>
                   <pic:blipFill>
-                    <a:blip r:embed="rId21"/>
+                    <a:blip r:embed="rId20"/>
                     <a:stretch>
                       <a:fillRect/>
                     </a:stretch>
@@ -2110,8 +2086,8 @@
         <w:t xml:space="preserve">Halaman Beranda</w:t>
       </w:r>
     </w:p>
-    <w:bookmarkEnd w:id="24"/>
-    <w:bookmarkStart w:id="28" w:name="daftar-produk"/>
+    <w:bookmarkEnd w:id="23"/>
+    <w:bookmarkStart w:id="27" w:name="daftar-produk"/>
     <w:p>
       <w:pPr>
         <w:pStyle w:val="Heading3"/>
@@ -2129,18 +2105,18 @@
           <wp:inline>
             <wp:extent cx="5334000" cy="4922837"/>
             <wp:effectExtent b="0" l="0" r="0" t="0"/>
-            <wp:docPr descr="Daftar Produk" title="" id="26" name="Picture"/>
+            <wp:docPr descr="Daftar Produk" title="" id="25" name="Picture"/>
             <a:graphic>
               <a:graphicData uri="http://schemas.openxmlformats.org/drawingml/2006/picture">
                 <pic:pic>
                   <pic:nvPicPr>
-                    <pic:cNvPr descr="screenshots/02-daftar-produk.png" id="27" name="Picture"/>
+                    <pic:cNvPr descr="screenshots/02-daftar-produk.png" id="26" name="Picture"/>
                     <pic:cNvPicPr>
                       <a:picLocks noChangeArrowheads="1" noChangeAspect="1"/>
                     </pic:cNvPicPr>
                   </pic:nvPicPr>
                   <pic:blipFill>
-                    <a:blip r:embed="rId25"/>
+                    <a:blip r:embed="rId24"/>
                     <a:stretch>
                       <a:fillRect/>
                     </a:stretch>
@@ -2175,8 +2151,8 @@
         <w:t xml:space="preserve">Daftar Produk</w:t>
       </w:r>
     </w:p>
-    <w:bookmarkEnd w:id="28"/>
-    <w:bookmarkStart w:id="32" w:name="detail-produk"/>
+    <w:bookmarkEnd w:id="27"/>
+    <w:bookmarkStart w:id="31" w:name="detail-produk"/>
     <w:p>
       <w:pPr>
         <w:pStyle w:val="Heading3"/>
@@ -2194,18 +2170,18 @@
           <wp:inline>
             <wp:extent cx="5334000" cy="3870854"/>
             <wp:effectExtent b="0" l="0" r="0" t="0"/>
-            <wp:docPr descr="Detail Produk" title="" id="30" name="Picture"/>
+            <wp:docPr descr="Detail Produk" title="" id="29" name="Picture"/>
             <a:graphic>
               <a:graphicData uri="http://schemas.openxmlformats.org/drawingml/2006/picture">
                 <pic:pic>
                   <pic:nvPicPr>
-                    <pic:cNvPr descr="screenshots/03-detail-produk.png" id="31" name="Picture"/>
+                    <pic:cNvPr descr="screenshots/03-detail-produk.png" id="30" name="Picture"/>
                     <pic:cNvPicPr>
                       <a:picLocks noChangeArrowheads="1" noChangeAspect="1"/>
                     </pic:cNvPicPr>
                   </pic:nvPicPr>
                   <pic:blipFill>
-                    <a:blip r:embed="rId29"/>
+                    <a:blip r:embed="rId28"/>
                     <a:stretch>
                       <a:fillRect/>
                     </a:stretch>
@@ -2240,8 +2216,8 @@
         <w:t xml:space="preserve">Detail Produk</w:t>
       </w:r>
     </w:p>
-    <w:bookmarkEnd w:id="32"/>
-    <w:bookmarkStart w:id="36" w:name="admin-daftar-produk"/>
+    <w:bookmarkEnd w:id="31"/>
+    <w:bookmarkStart w:id="35" w:name="admin-daftar-produk"/>
     <w:p>
       <w:pPr>
         <w:pStyle w:val="Heading3"/>
@@ -2259,18 +2235,18 @@
           <wp:inline>
             <wp:extent cx="5334000" cy="4856162"/>
             <wp:effectExtent b="0" l="0" r="0" t="0"/>
-            <wp:docPr descr="Admin List" title="" id="34" name="Picture"/>
+            <wp:docPr descr="Admin List" title="" id="33" name="Picture"/>
             <a:graphic>
               <a:graphicData uri="http://schemas.openxmlformats.org/drawingml/2006/picture">
                 <pic:pic>
                   <pic:nvPicPr>
-                    <pic:cNvPr descr="screenshots/04-admin-list.png" id="35" name="Picture"/>
+                    <pic:cNvPr descr="screenshots/04-admin-list.png" id="34" name="Picture"/>
                     <pic:cNvPicPr>
                       <a:picLocks noChangeArrowheads="1" noChangeAspect="1"/>
                     </pic:cNvPicPr>
                   </pic:nvPicPr>
                   <pic:blipFill>
-                    <a:blip r:embed="rId33"/>
+                    <a:blip r:embed="rId32"/>
                     <a:stretch>
                       <a:fillRect/>
                     </a:stretch>
@@ -2305,8 +2281,8 @@
         <w:t xml:space="preserve">Admin List</w:t>
       </w:r>
     </w:p>
-    <w:bookmarkEnd w:id="36"/>
-    <w:bookmarkStart w:id="40" w:name="admin-tambah-produk"/>
+    <w:bookmarkEnd w:id="35"/>
+    <w:bookmarkStart w:id="39" w:name="admin-tambah-produk"/>
     <w:p>
       <w:pPr>
         <w:pStyle w:val="Heading3"/>
@@ -2324,18 +2300,18 @@
           <wp:inline>
             <wp:extent cx="5334000" cy="4530195"/>
             <wp:effectExtent b="0" l="0" r="0" t="0"/>
-            <wp:docPr descr="Admin Form Tambah" title="" id="38" name="Picture"/>
+            <wp:docPr descr="Admin Form Tambah" title="" id="37" name="Picture"/>
             <a:graphic>
               <a:graphicData uri="http://schemas.openxmlformats.org/drawingml/2006/picture">
                 <pic:pic>
                   <pic:nvPicPr>
-                    <pic:cNvPr descr="screenshots/05-admin-form-tambah.png" id="39" name="Picture"/>
+                    <pic:cNvPr descr="screenshots/05-admin-form-tambah.png" id="38" name="Picture"/>
                     <pic:cNvPicPr>
                       <a:picLocks noChangeArrowheads="1" noChangeAspect="1"/>
                     </pic:cNvPicPr>
                   </pic:nvPicPr>
                   <pic:blipFill>
-                    <a:blip r:embed="rId37"/>
+                    <a:blip r:embed="rId36"/>
                     <a:stretch>
                       <a:fillRect/>
                     </a:stretch>
@@ -2370,8 +2346,8 @@
         <w:t xml:space="preserve">Admin Form Tambah</w:t>
       </w:r>
     </w:p>
-    <w:bookmarkEnd w:id="40"/>
-    <w:bookmarkStart w:id="44" w:name="admin-edit-produk"/>
+    <w:bookmarkEnd w:id="39"/>
+    <w:bookmarkStart w:id="43" w:name="admin-edit-produk"/>
     <w:p>
       <w:pPr>
         <w:pStyle w:val="Heading3"/>
@@ -2389,18 +2365,18 @@
           <wp:inline>
             <wp:extent cx="5334000" cy="4530195"/>
             <wp:effectExtent b="0" l="0" r="0" t="0"/>
-            <wp:docPr descr="Admin Form Edit" title="" id="42" name="Picture"/>
+            <wp:docPr descr="Admin Form Edit" title="" id="41" name="Picture"/>
             <a:graphic>
               <a:graphicData uri="http://schemas.openxmlformats.org/drawingml/2006/picture">
                 <pic:pic>
                   <pic:nvPicPr>
-                    <pic:cNvPr descr="screenshots/06-admin-form-edit.png" id="43" name="Picture"/>
+                    <pic:cNvPr descr="screenshots/06-admin-form-edit.png" id="42" name="Picture"/>
                     <pic:cNvPicPr>
                       <a:picLocks noChangeArrowheads="1" noChangeAspect="1"/>
                     </pic:cNvPicPr>
                   </pic:nvPicPr>
                   <pic:blipFill>
-                    <a:blip r:embed="rId41"/>
+                    <a:blip r:embed="rId40"/>
                     <a:stretch>
                       <a:fillRect/>
                     </a:stretch>
@@ -2435,8 +2411,8 @@
         <w:t xml:space="preserve">Admin Form Edit</w:t>
       </w:r>
     </w:p>
-    <w:bookmarkEnd w:id="44"/>
-    <w:bookmarkStart w:id="48" w:name="terminal-backend"/>
+    <w:bookmarkEnd w:id="43"/>
+    <w:bookmarkStart w:id="47" w:name="terminal-backend"/>
     <w:p>
       <w:pPr>
         <w:pStyle w:val="Heading3"/>
@@ -2454,18 +2430,18 @@
           <wp:inline>
             <wp:extent cx="5334000" cy="2252133"/>
             <wp:effectExtent b="0" l="0" r="0" t="0"/>
-            <wp:docPr descr="Terminal Backend" title="" id="46" name="Picture"/>
+            <wp:docPr descr="Terminal Backend" title="" id="45" name="Picture"/>
             <a:graphic>
               <a:graphicData uri="http://schemas.openxmlformats.org/drawingml/2006/picture">
                 <pic:pic>
                   <pic:nvPicPr>
-                    <pic:cNvPr descr="screenshots/08-terminal-backend.png" id="47" name="Picture"/>
+                    <pic:cNvPr descr="screenshots/08-terminal-backend.png" id="46" name="Picture"/>
                     <pic:cNvPicPr>
                       <a:picLocks noChangeArrowheads="1" noChangeAspect="1"/>
                     </pic:cNvPicPr>
                   </pic:nvPicPr>
                   <pic:blipFill>
-                    <a:blip r:embed="rId45"/>
+                    <a:blip r:embed="rId44"/>
                     <a:stretch>
                       <a:fillRect/>
                     </a:stretch>
@@ -2500,8 +2476,8 @@
         <w:t xml:space="preserve">Terminal Backend</w:t>
       </w:r>
     </w:p>
-    <w:bookmarkEnd w:id="48"/>
-    <w:bookmarkStart w:id="61" w:name="mongodb-atlas-collection"/>
+    <w:bookmarkEnd w:id="47"/>
+    <w:bookmarkStart w:id="60" w:name="mongodb-atlas-collection"/>
     <w:p>
       <w:pPr>
         <w:pStyle w:val="Heading3"/>
@@ -2575,18 +2551,18 @@
           <wp:inline>
             <wp:extent cx="5334000" cy="3753249"/>
             <wp:effectExtent b="0" l="0" r="0" t="0"/>
-            <wp:docPr descr="Atlas Data Explorer 1" title="" id="50" name="Picture"/>
+            <wp:docPr descr="Atlas Data Explorer 1" title="" id="49" name="Picture"/>
             <a:graphic>
               <a:graphicData uri="http://schemas.openxmlformats.org/drawingml/2006/picture">
                 <pic:pic>
                   <pic:nvPicPr>
-                    <pic:cNvPr descr="screenshots/07a-atlas.png" id="51" name="Picture"/>
+                    <pic:cNvPr descr="screenshots/07a-atlas.png" id="50" name="Picture"/>
                     <pic:cNvPicPr>
                       <a:picLocks noChangeArrowheads="1" noChangeAspect="1"/>
                     </pic:cNvPicPr>
                   </pic:nvPicPr>
                   <pic:blipFill>
-                    <a:blip r:embed="rId49"/>
+                    <a:blip r:embed="rId48"/>
                     <a:stretch>
                       <a:fillRect/>
                     </a:stretch>
@@ -2630,18 +2606,18 @@
           <wp:inline>
             <wp:extent cx="5334000" cy="3758609"/>
             <wp:effectExtent b="0" l="0" r="0" t="0"/>
-            <wp:docPr descr="Atlas Data Explorer 2" title="" id="53" name="Picture"/>
+            <wp:docPr descr="Atlas Data Explorer 2" title="" id="52" name="Picture"/>
             <a:graphic>
               <a:graphicData uri="http://schemas.openxmlformats.org/drawingml/2006/picture">
                 <pic:pic>
                   <pic:nvPicPr>
-                    <pic:cNvPr descr="screenshots/07b-atlas.png" id="54" name="Picture"/>
+                    <pic:cNvPr descr="screenshots/07b-atlas.png" id="53" name="Picture"/>
                     <pic:cNvPicPr>
                       <a:picLocks noChangeArrowheads="1" noChangeAspect="1"/>
                     </pic:cNvPicPr>
                   </pic:nvPicPr>
                   <pic:blipFill>
-                    <a:blip r:embed="rId52"/>
+                    <a:blip r:embed="rId51"/>
                     <a:stretch>
                       <a:fillRect/>
                     </a:stretch>
@@ -2685,18 +2661,18 @@
           <wp:inline>
             <wp:extent cx="5334000" cy="3755697"/>
             <wp:effectExtent b="0" l="0" r="0" t="0"/>
-            <wp:docPr descr="Atlas Data Explorer 3" title="" id="56" name="Picture"/>
+            <wp:docPr descr="Atlas Data Explorer 3" title="" id="55" name="Picture"/>
             <a:graphic>
               <a:graphicData uri="http://schemas.openxmlformats.org/drawingml/2006/picture">
                 <pic:pic>
                   <pic:nvPicPr>
-                    <pic:cNvPr descr="screenshots/07c-atlas.png" id="57" name="Picture"/>
+                    <pic:cNvPr descr="screenshots/07c-atlas.png" id="56" name="Picture"/>
                     <pic:cNvPicPr>
                       <a:picLocks noChangeArrowheads="1" noChangeAspect="1"/>
                     </pic:cNvPicPr>
                   </pic:nvPicPr>
                   <pic:blipFill>
-                    <a:blip r:embed="rId55"/>
+                    <a:blip r:embed="rId54"/>
                     <a:stretch>
                       <a:fillRect/>
                     </a:stretch>
@@ -2740,18 +2716,18 @@
           <wp:inline>
             <wp:extent cx="5334000" cy="3759829"/>
             <wp:effectExtent b="0" l="0" r="0" t="0"/>
-            <wp:docPr descr="Atlas Data Explorer 4" title="" id="59" name="Picture"/>
+            <wp:docPr descr="Atlas Data Explorer 4" title="" id="58" name="Picture"/>
             <a:graphic>
               <a:graphicData uri="http://schemas.openxmlformats.org/drawingml/2006/picture">
                 <pic:pic>
                   <pic:nvPicPr>
-                    <pic:cNvPr descr="screenshots/07d-atlas.png" id="60" name="Picture"/>
+                    <pic:cNvPr descr="screenshots/07d-atlas.png" id="59" name="Picture"/>
                     <pic:cNvPicPr>
                       <a:picLocks noChangeArrowheads="1" noChangeAspect="1"/>
                     </pic:cNvPicPr>
                   </pic:nvPicPr>
                   <pic:blipFill>
-                    <a:blip r:embed="rId58"/>
+                    <a:blip r:embed="rId57"/>
                     <a:stretch>
                       <a:fillRect/>
                     </a:stretch>
@@ -2793,9 +2769,9 @@
         </w:pict>
       </w:r>
     </w:p>
+    <w:bookmarkEnd w:id="60"/>
     <w:bookmarkEnd w:id="61"/>
-    <w:bookmarkEnd w:id="62"/>
-    <w:bookmarkStart w:id="63" w:name="i.-troubleshooting"/>
+    <w:bookmarkStart w:id="62" w:name="i.-troubleshooting"/>
     <w:p>
       <w:pPr>
         <w:pStyle w:val="Heading2"/>
@@ -2975,8 +2951,8 @@
         <w:t xml:space="preserve">di backend.</w:t>
       </w:r>
     </w:p>
+    <w:bookmarkEnd w:id="62"/>
     <w:bookmarkEnd w:id="63"/>
-    <w:bookmarkEnd w:id="64"/>
     <w:sectPr>
       <w:footnotePr>
         <w:numRestart w:val="eachSect"/>

</xml_diff>